<commit_message>
Brief prueba CM: se graba desde casa (narrador, hoja en vez de tablero), regla de sugerencias aparte
Co-Authored-By: Claude Fable 5.1 <noreply@anthropic.com>
</commit_message>
<xml_diff>
--- a/recursos/comercial/contratacion/COMMUNITY_MANAGER/BRIEF_PRUEBA_PRACTICA_CM.docx
+++ b/recursos/comercial/contratacion/COMMUNITY_MANAGER/BRIEF_PRUEBA_PRACTICA_CM.docx
@@ -118,7 +118,7 @@
           <w:color w:val="E54C09"/>
           <w:sz w:val="26"/>
         </w:rPr>
-        <w:t>2. El guion asignado: GUION 4 "Siete meses" (anuncio V3_575H)</w:t>
+        <w:t>2. El guion asignado: GUION 4 "Siete meses" (anuncio V3_575H) — se graba desde casa</w:t>
       </w:r>
     </w:p>
     <w:p>
@@ -127,10 +127,31 @@
       </w:pPr>
       <w:r>
         <w:rPr>
+          <w:b/>
+          <w:sz w:val="21"/>
+        </w:rPr>
+        <w:t>No tienes que venir a la academia.</w:t>
+      </w:r>
+      <w:r>
+        <w:rPr>
           <w:b w:val="0"/>
           <w:sz w:val="21"/>
         </w:rPr>
-        <w:t>Necesitas a la profe y el tablero del salón vacío, unos 15 minutos antes de una clase. Gerencia coordina el día y la hora con la profe; tú llegas con tu equipo. La profe dice el texto; tú diriges el encuadre, el audio y las tomas (2 tomas mínimo).</w:t>
+        <w:t xml:space="preserve"> Te grabas tú, o alguien que te haga el favor, en tu casa o donde quieras. Quien sale a cámara habla como </w:t>
+      </w:r>
+      <w:r>
+        <w:rPr>
+          <w:b/>
+          <w:sz w:val="21"/>
+        </w:rPr>
+        <w:t>narrador(a)</w:t>
+      </w:r>
+      <w:r>
+        <w:rPr>
+          <w:b w:val="0"/>
+          <w:sz w:val="21"/>
+        </w:rPr>
+        <w:t>: no dice ser profesor(a) ni estudiante de Heiiu. El guion es el que usa el videógrafo con la profe; abajo están las adaptaciones para casa. Todo lo demás se ejecuta tal cual.</w:t>
       </w:r>
     </w:p>
     <w:tbl>
@@ -307,6 +328,99 @@
       </w:tr>
     </w:tbl>
     <w:p/>
+    <w:p>
+      <w:pPr>
+        <w:spacing w:after="40"/>
+      </w:pPr>
+      <w:r>
+        <w:rPr>
+          <w:b/>
+          <w:sz w:val="21"/>
+        </w:rPr>
+        <w:t>Adaptaciones para grabar en casa (solo estas):</w:t>
+      </w:r>
+    </w:p>
+    <w:p>
+      <w:pPr>
+        <w:spacing w:after="40"/>
+      </w:pPr>
+      <w:r>
+        <w:rPr>
+          <w:b w:val="0"/>
+          <w:sz w:val="21"/>
+        </w:rPr>
+        <w:t>•  El tablero se reemplaza por una hoja, cartulina o pizarra pequeña: se escribe "5 AÑOS" grande, se tacha, y luego "575 h", "7 meses", "14 meses". Tienen que quedar legibles en cámara.</w:t>
+      </w:r>
+    </w:p>
+    <w:p>
+      <w:pPr>
+        <w:spacing w:after="40"/>
+      </w:pPr>
+      <w:r>
+        <w:rPr>
+          <w:b w:val="0"/>
+          <w:sz w:val="21"/>
+        </w:rPr>
+        <w:t>•  Donde el texto dice "Aquí", se dice "En Heiiu".</w:t>
+      </w:r>
+    </w:p>
+    <w:p>
+      <w:pPr>
+        <w:spacing w:after="40"/>
+      </w:pPr>
+      <w:r>
+        <w:rPr>
+          <w:b w:val="0"/>
+          <w:sz w:val="21"/>
+        </w:rPr>
+        <w:t>•  La persona habla a cámara, plano medio, fondo limpio (una pared), sin logos de otras marcas ni ropa con marcas.</w:t>
+      </w:r>
+    </w:p>
+    <w:p>
+      <w:pPr>
+        <w:spacing w:after="40"/>
+      </w:pPr>
+      <w:r>
+        <w:rPr>
+          <w:b w:val="0"/>
+          <w:sz w:val="21"/>
+        </w:rPr>
+        <w:t>•  Si no tienes a nadie que te ayude, te grabas tú misma: cuenta igual.</w:t>
+      </w:r>
+    </w:p>
+    <w:p>
+      <w:pPr>
+        <w:spacing w:after="120"/>
+      </w:pPr>
+      <w:r>
+        <w:rPr>
+          <w:b/>
+          <w:sz w:val="21"/>
+        </w:rPr>
+        <w:t>Sobre las opiniones:</w:t>
+      </w:r>
+      <w:r>
+        <w:rPr>
+          <w:b w:val="0"/>
+          <w:sz w:val="21"/>
+        </w:rPr>
+        <w:t xml:space="preserve"> si crees que algo del guion debería cambiar (una palabra, el orden, el gancho), </w:t>
+      </w:r>
+      <w:r>
+        <w:rPr>
+          <w:b/>
+          <w:sz w:val="21"/>
+        </w:rPr>
+        <w:t>entregas el video como está escrito</w:t>
+      </w:r>
+      <w:r>
+        <w:rPr>
+          <w:b w:val="0"/>
+          <w:sz w:val="21"/>
+        </w:rPr>
+        <w:t xml:space="preserve"> y mandas tus sugerencias aparte, en un mensaje de WhatsApp, con el porqué. Las dos cosas se valoran: que ejecutes lo que se pide y que pienses. Lo que no se valora es cambiar el guion por tu cuenta.</w:t>
+      </w:r>
+    </w:p>
     <w:p>
       <w:pPr>
         <w:spacing w:before="200" w:after="60"/>
@@ -682,7 +796,7 @@
           <w:b w:val="0"/>
           <w:sz w:val="21"/>
         </w:rPr>
-        <w:t xml:space="preserve"> completo en una carpeta de Drive compartida (sirve para cortar otros ganchos sin volver a grabar).</w:t>
+        <w:t xml:space="preserve"> en una carpeta de Drive compartida (sirve para cortar otros ganchos sin volver a grabar).</w:t>
       </w:r>
     </w:p>
     <w:p>
@@ -708,7 +822,7 @@
           <w:b w:val="0"/>
           <w:sz w:val="21"/>
         </w:rPr>
-        <w:t xml:space="preserve"> máximo 5 días calendario después de la grabación. Tú propones la fecha de entrega al confirmar.</w:t>
+        <w:t xml:space="preserve"> máximo 5 días calendario desde que recibes este brief. Tú propones la fecha de entrega al confirmar.</w:t>
       </w:r>
     </w:p>
     <w:p>
@@ -909,7 +1023,7 @@
                 <w:b w:val="0"/>
                 <w:sz w:val="19"/>
               </w:rPr>
-              <w:t>Voz limpia sin eco ni ruido; encuadre estable; sin aro de luz.</w:t>
+              <w:t>Voz limpia sin eco ni ruido; encuadre estable; sin aro de luz; la hoja con las cifras se lee.</w:t>
             </w:r>
           </w:p>
         </w:tc>
@@ -955,7 +1069,7 @@
                 <w:b/>
                 <w:sz w:val="19"/>
               </w:rPr>
-              <w:t>7. Entrega</w:t>
+              <w:t>7. Entrega y sugerencias</w:t>
             </w:r>
           </w:p>
         </w:tc>
@@ -969,7 +1083,7 @@
                 <w:b w:val="0"/>
                 <w:sz w:val="19"/>
               </w:rPr>
-              <w:t>En la fecha que propusiste.</w:t>
+              <w:t>En la fecha que propusiste. El video va como está escrito; las sugerencias, si las hay, aparte y con su porqué.</w:t>
             </w:r>
           </w:p>
         </w:tc>

</xml_diff>

<commit_message>
Brief prueba CM regenerado con los dos tipos de contenido
Co-Authored-By: Claude Fable 5.1 <noreply@anthropic.com>
</commit_message>
<xml_diff>
--- a/recursos/comercial/contratacion/COMMUNITY_MANAGER/BRIEF_PRUEBA_PRACTICA_CM.docx
+++ b/recursos/comercial/contratacion/COMMUNITY_MANAGER/BRIEF_PRUEBA_PRACTICA_CM.docx
@@ -1112,21 +1112,49 @@
           <w:b w:val="0"/>
           <w:sz w:val="21"/>
         </w:rPr>
-        <w:t xml:space="preserve">Si pasas la prueba, se firma el contrato de prestación de servicios en las condiciones conversadas. Dentro del trabajo mensual, además de las historias, piezas y testimonios, </w:t>
+        <w:t xml:space="preserve">Si pasas la prueba, se firma el contrato de prestación de servicios en las condiciones conversadas. En el trabajo mensual hay </w:t>
       </w:r>
       <w:r>
         <w:rPr>
           <w:b/>
           <w:sz w:val="21"/>
         </w:rPr>
-        <w:t>producirás anuncios a partir de los guiones de gerencia con estas mismas reglas</w:t>
+        <w:t>dos tipos de contenido</w:t>
       </w:r>
       <w:r>
         <w:rPr>
           <w:b w:val="0"/>
           <w:sz w:val="21"/>
         </w:rPr>
-        <w:t>: ese material se suma al del videógrafo y se entrega listo para la pauta. La prueba es una muestra real de esa parte del trabajo.</w:t>
+        <w:t xml:space="preserve">: (1) </w:t>
+      </w:r>
+      <w:r>
+        <w:rPr>
+          <w:b/>
+          <w:sz w:val="21"/>
+        </w:rPr>
+        <w:t>los anuncios para pauta</w:t>
+      </w:r>
+      <w:r>
+        <w:rPr>
+          <w:b w:val="0"/>
+          <w:sz w:val="21"/>
+        </w:rPr>
+        <w:t xml:space="preserve">, que salen de guiones escritos por gerencia y se ejecutan tal cual, con estas mismas reglas (es lo que mide esta prueba); y (2) </w:t>
+      </w:r>
+      <w:r>
+        <w:rPr>
+          <w:b/>
+          <w:sz w:val="21"/>
+        </w:rPr>
+        <w:t>el contenido orgánico</w:t>
+      </w:r>
+      <w:r>
+        <w:rPr>
+          <w:b w:val="0"/>
+          <w:sz w:val="21"/>
+        </w:rPr>
+        <w:t>: testimonios, ejercicios en clase, historias y el día a día de la academia, donde la creatividad es tuya, con poca guía y respetando solo las reglas de mensaje de Heiiu (la lista de prohibidos de la sección 3). La mayor parte del mes es del segundo tipo; la prueba mide el primero porque es donde más cuesta encontrar a alguien que ejecute sin cambiar lo escrito.</w:t>
       </w:r>
     </w:p>
     <w:p>

</xml_diff>

<commit_message>
Brief prueba CM: sin mensaje prellenado (lo configura el trafficker); codigo solo en nombre de archivo
Co-Authored-By: Claude Fable 5.1 <noreply@anthropic.com>
</commit_message>
<xml_diff>
--- a/recursos/comercial/contratacion/COMMUNITY_MANAGER/BRIEF_PRUEBA_PRACTICA_CM.docx
+++ b/recursos/comercial/contratacion/COMMUNITY_MANAGER/BRIEF_PRUEBA_PRACTICA_CM.docx
@@ -179,17 +179,6 @@
                 <w:sz w:val="20"/>
               </w:rPr>
               <w:t>GUION 4 — SIETE MESES   [PRIORITARIO]   · anuncio V3_575H</w:t>
-            </w:r>
-          </w:p>
-          <w:p>
-            <w:pPr>
-              <w:spacing w:after="60"/>
-            </w:pPr>
-            <w:r>
-              <w:rPr>
-                <w:sz w:val="20"/>
-              </w:rPr>
-              <w:t>Mensaje prellenado del botón de WhatsApp: "Hola, vi el video de los 7 meses (V3). ¿Qué jornada me sirve?"</w:t>
             </w:r>
           </w:p>
           <w:p>
@@ -744,7 +733,21 @@
           <w:b w:val="0"/>
           <w:sz w:val="21"/>
         </w:rPr>
-        <w:t>.</w:t>
+        <w:t xml:space="preserve">. El código identifica el guion para el trafficker, que es quien sube los anuncios a Meta y configura el botón de WhatsApp. </w:t>
+      </w:r>
+      <w:r>
+        <w:rPr>
+          <w:b/>
+          <w:sz w:val="21"/>
+        </w:rPr>
+        <w:t>Tú no subes nada a Meta</w:t>
+      </w:r>
+      <w:r>
+        <w:rPr>
+          <w:b w:val="0"/>
+          <w:sz w:val="21"/>
+        </w:rPr>
+        <w:t xml:space="preserve"> ni configuras mensajes.</w:t>
       </w:r>
     </w:p>
     <w:p>

</xml_diff>

<commit_message>
Brief prueba CM: rol = anuncios con guion en la academia (como el videografo) + organico con creatividad e ideas de gerencia
Co-Authored-By: Claude Fable 5.1 <noreply@anthropic.com>
</commit_message>
<xml_diff>
--- a/recursos/comercial/contratacion/COMMUNITY_MANAGER/BRIEF_PRUEBA_PRACTICA_CM.docx
+++ b/recursos/comercial/contratacion/COMMUNITY_MANAGER/BRIEF_PRUEBA_PRACTICA_CM.docx
@@ -1115,14 +1115,14 @@
           <w:b w:val="0"/>
           <w:sz w:val="21"/>
         </w:rPr>
-        <w:t xml:space="preserve">Si pasas la prueba, se firma el contrato de prestación de servicios en las condiciones conversadas. En el trabajo mensual hay </w:t>
+        <w:t xml:space="preserve">Si pasas la prueba, se firma el contrato de prestación de servicios en las condiciones conversadas. El trabajo mensual tiene </w:t>
       </w:r>
       <w:r>
         <w:rPr>
           <w:b/>
           <w:sz w:val="21"/>
         </w:rPr>
-        <w:t>dos tipos de contenido</w:t>
+        <w:t>dos partes</w:t>
       </w:r>
       <w:r>
         <w:rPr>
@@ -1143,7 +1143,7 @@
           <w:b w:val="0"/>
           <w:sz w:val="21"/>
         </w:rPr>
-        <w:t xml:space="preserve">, que salen de guiones escritos por gerencia y se ejecutan tal cual, con estas mismas reglas (es lo que mide esta prueba); y (2) </w:t>
+        <w:t xml:space="preserve">: recibes el guion escrito por gerencia, grabas en la academia con los profes y los estudiantes, editas y entregas el video listo con su código, con estas mismas reglas (hoy lo hace nuestro videógrafo; esta prueba mide esa parte, desde casa, antes de grabar en la academia); y (2) </w:t>
       </w:r>
       <w:r>
         <w:rPr>
@@ -1157,7 +1157,7 @@
           <w:b w:val="0"/>
           <w:sz w:val="21"/>
         </w:rPr>
-        <w:t>: testimonios, ejercicios en clase, historias y el día a día de la academia, donde la creatividad es tuya, con poca guía y respetando solo las reglas de mensaje de Heiiu (la lista de prohibidos de la sección 3). La mayor parte del mes es del segundo tipo; la prueba mide el primero porque es donde más cuesta encontrar a alguien que ejecute sin cambiar lo escrito.</w:t>
+        <w:t>: testimonios, ejercicios en clase, historias y el día a día de la academia, guiado por tu creatividad y por las ideas que te demos, respetando las reglas de mensaje de Heiiu (la lista de prohibidos de la sección 3).</w:t>
       </w:r>
     </w:p>
     <w:p>

</xml_diff>

<commit_message>
Brief prueba CM: guion como tabla de rodaje segundo a segundo; flujo gerencia->trafficker con palabras de Diana
Co-Authored-By: Claude Fable 5.1 <noreply@anthropic.com>
</commit_message>
<xml_diff>
--- a/recursos/comercial/contratacion/COMMUNITY_MANAGER/BRIEF_PRUEBA_PRACTICA_CM.docx
+++ b/recursos/comercial/contratacion/COMMUNITY_MANAGER/BRIEF_PRUEBA_PRACTICA_CM.docx
@@ -63,7 +63,7 @@
           <w:b w:val="0"/>
           <w:sz w:val="21"/>
         </w:rPr>
-        <w:t xml:space="preserve">En Heiiu los anuncios se producen a partir de </w:t>
+        <w:t xml:space="preserve">En Heiiu los anuncios de pauta paga se producen a partir de </w:t>
       </w:r>
       <w:r>
         <w:rPr>
@@ -77,7 +77,7 @@
           <w:b w:val="0"/>
           <w:sz w:val="21"/>
         </w:rPr>
-        <w:t xml:space="preserve">: cada guion trae el gancho, el texto que se dice tal cual, lo que se ve, el texto en pantalla, el cierre y un </w:t>
+        <w:t xml:space="preserve">: cada guion trae los primeros segundos que detienen a la persona, el texto que se dice tal cual, lo que se ve, las letras que van en pantalla, el cierre y un </w:t>
       </w:r>
       <w:r>
         <w:rPr>
@@ -91,21 +91,21 @@
           <w:b w:val="0"/>
           <w:sz w:val="21"/>
         </w:rPr>
-        <w:t xml:space="preserve"> que identifica el anuncio en la pauta. El videógrafo recibe el guion, graba y entrega el video listo para subir a Meta, sin que gerencia intervenga. La prueba es exactamente eso: </w:t>
+        <w:t xml:space="preserve"> que identifica el anuncio. El CM recibe el guion, graba, edita y entrega el video a gerencia para aprobación; gerencia se lo pasa al trafficker, que lo sube a Meta. La prueba es exactamente eso: </w:t>
       </w:r>
       <w:r>
         <w:rPr>
           <w:b/>
           <w:sz w:val="21"/>
         </w:rPr>
-        <w:t>tomas UN guion del paquete actual y entregas el anuncio terminado</w:t>
+        <w:t>te enviamos UN guion y entregas el video terminado</w:t>
       </w:r>
       <w:r>
         <w:rPr>
           <w:b w:val="0"/>
           <w:sz w:val="21"/>
         </w:rPr>
-        <w:t>, con las mismas reglas de entrega que usa el videógrafo. No es una pieza libre ni un video "creativo": se evalúa que el guion se ejecute como está escrito y que el archivo quede listo para pauta.</w:t>
+        <w:t>, con las reglas de las secciones 3 y 4. Estos videos no son libres ni creativos, a diferencia de los orgánicos, porque son los que llevan el presupuesto de pauta: buscamos que el guion se ejecute como está escrito y que el archivo quede listo para pauta.</w:t>
       </w:r>
     </w:p>
     <w:p>
@@ -154,6 +154,25 @@
         <w:t>: no dice ser profesor(a) ni estudiante de Heiiu. El guion es el que usa el videógrafo con la profe; abajo están las adaptaciones para casa. Todo lo demás se ejecuta tal cual.</w:t>
       </w:r>
     </w:p>
+    <w:p>
+      <w:pPr>
+        <w:spacing w:after="80"/>
+      </w:pPr>
+      <w:r>
+        <w:rPr>
+          <w:b/>
+          <w:sz w:val="21"/>
+        </w:rPr>
+        <w:t>Tres palabras que vas a ver abajo:</w:t>
+      </w:r>
+      <w:r>
+        <w:rPr>
+          <w:b w:val="0"/>
+          <w:sz w:val="21"/>
+        </w:rPr>
+        <w:t xml:space="preserve"> *los primeros 2 segundos* son lo que hace que la persona deje de deslizar en Instagram o TikTok y se quede viendo; *lo que se dice* va hablado y además en subtítulos palabra por palabra; *las letras en pantalla* son textos grandes sobre el video (no son los subtítulos), en naranja o amarillo de la marca.</w:t>
+      </w:r>
+    </w:p>
     <w:tbl>
       <w:tblPr>
         <w:tblStyle w:val="TableGrid"/>
@@ -161,162 +180,413 @@
         <w:tblLook w:firstColumn="1" w:firstRow="1" w:lastColumn="0" w:lastRow="0" w:noHBand="0" w:noVBand="1" w:val="04A0"/>
       </w:tblPr>
       <w:tblGrid>
-        <w:gridCol w:w="10080"/>
+        <w:gridCol w:w="2520"/>
+        <w:gridCol w:w="2520"/>
+        <w:gridCol w:w="2520"/>
+        <w:gridCol w:w="2520"/>
       </w:tblGrid>
       <w:tr>
         <w:tc>
           <w:tcPr>
-            <w:tcW w:type="dxa" w:w="10080"/>
+            <w:tcW w:type="dxa" w:w="2520"/>
           </w:tcPr>
           <w:p>
-            <w:pPr>
-              <w:spacing w:after="60"/>
-            </w:pPr>
             <w:r>
               <w:rPr>
                 <w:b/>
-                <w:color w:val="E54C09"/>
-                <w:sz w:val="20"/>
+                <w:sz w:val="19"/>
               </w:rPr>
-              <w:t>GUION 4 — SIETE MESES   [PRIORITARIO]   · anuncio V3_575H</w:t>
+              <w:t>Segundos</w:t>
             </w:r>
           </w:p>
+        </w:tc>
+        <w:tc>
+          <w:tcPr>
+            <w:tcW w:type="dxa" w:w="2520"/>
+          </w:tcPr>
           <w:p>
-            <w:pPr>
-              <w:spacing w:after="60"/>
-            </w:pPr>
             <w:r>
               <w:rPr>
-                <w:sz w:val="20"/>
+                <w:b/>
+                <w:sz w:val="19"/>
               </w:rPr>
-              <w:t>GANCHO (segundos 0-2, lo que para el dedo): El profe escribe en el tablero un "5 AÑOS" grande y lo tacha. Texto: "Lo que tarda el inglés a 2 horas por semana." Política: "7 meses" es descripción del programa; jamás "garantizado que hablas en 7 meses".</w:t>
+              <w:t>Qué se ve</w:t>
             </w:r>
           </w:p>
+        </w:tc>
+        <w:tc>
+          <w:tcPr>
+            <w:tcW w:type="dxa" w:w="2520"/>
+          </w:tcPr>
           <w:p>
-            <w:pPr>
-              <w:spacing w:after="60"/>
-            </w:pPr>
             <w:r>
               <w:rPr>
-                <w:sz w:val="20"/>
+                <w:b/>
+                <w:sz w:val="19"/>
               </w:rPr>
-              <w:t>Qué vende: Velocidad con número: el Marco Común Europeo estima 500-600 h guiadas para B2 (rango; varía por academia); Heiiu son 575 h en 7 meses (4 h/día) o 14 (2 h/noche). Es el único "rápido" verificable del mercado; los demás no publican horas.</w:t>
+              <w:t>Qué dice la persona (tal cual)</w:t>
             </w:r>
           </w:p>
+        </w:tc>
+        <w:tc>
+          <w:tcPr>
+            <w:tcW w:type="dxa" w:w="2520"/>
+          </w:tcPr>
           <w:p>
-            <w:pPr>
-              <w:spacing w:after="60"/>
-            </w:pPr>
             <w:r>
               <w:rPr>
-                <w:sz w:val="20"/>
+                <w:b/>
+                <w:sz w:val="19"/>
               </w:rPr>
-              <w:t>Quién habla: Profe a cámara, con el tablero detrás donde escribe (de verdad, en el momento) "575 h" y "7 meses".   ·   Duración: 25 s</w:t>
+              <w:t>Letras grandes en pantalla</w:t>
             </w:r>
           </w:p>
+        </w:tc>
+      </w:tr>
+      <w:tr>
+        <w:tc>
+          <w:tcPr>
+            <w:tcW w:type="dxa" w:w="2520"/>
+          </w:tcPr>
           <w:p>
-            <w:pPr>
-              <w:spacing w:after="60"/>
-            </w:pPr>
             <w:r>
               <w:rPr>
-                <w:sz w:val="20"/>
+                <w:b/>
+                <w:sz w:val="19"/>
               </w:rPr>
-              <w:t>Qué se ve: Plano medio; el profe se voltea y escribe en el tablero mientras habla; vuelve a cámara.</w:t>
+              <w:t>0-2</w:t>
             </w:r>
           </w:p>
+        </w:tc>
+        <w:tc>
+          <w:tcPr>
+            <w:tcW w:type="dxa" w:w="2520"/>
+          </w:tcPr>
           <w:p>
-            <w:pPr>
-              <w:spacing w:after="60"/>
-            </w:pPr>
             <w:r>
               <w:rPr>
-                <w:sz w:val="20"/>
+                <w:b w:val="0"/>
+                <w:sz w:val="19"/>
               </w:rPr>
-              <w:t>Texto (se dice tal cual, con subtítulos):</w:t>
+              <w:t>Primer plano de la hoja: escribe "5 AÑOS" grande y lo tacha con una raya.</w:t>
             </w:r>
           </w:p>
+        </w:tc>
+        <w:tc>
+          <w:tcPr>
+            <w:tcW w:type="dxa" w:w="2520"/>
+          </w:tcPr>
           <w:p>
-            <w:pPr>
-              <w:spacing w:after="60"/>
-            </w:pPr>
             <w:r>
               <w:rPr>
-                <w:sz w:val="20"/>
+                <w:b w:val="0"/>
+                <w:sz w:val="19"/>
+              </w:rPr>
+              <w:t>(no habla todavía)</w:t>
+            </w:r>
+          </w:p>
+        </w:tc>
+        <w:tc>
+          <w:tcPr>
+            <w:tcW w:type="dxa" w:w="2520"/>
+          </w:tcPr>
+          <w:p>
+            <w:r>
+              <w:rPr>
+                <w:b w:val="0"/>
+                <w:sz w:val="19"/>
+              </w:rPr>
+              <w:t>"Lo que tarda el inglés a 2 horas por semana."</w:t>
+            </w:r>
+          </w:p>
+        </w:tc>
+      </w:tr>
+      <w:tr>
+        <w:tc>
+          <w:tcPr>
+            <w:tcW w:type="dxa" w:w="2520"/>
+          </w:tcPr>
+          <w:p>
+            <w:r>
+              <w:rPr>
+                <w:b/>
+                <w:sz w:val="19"/>
+              </w:rPr>
+              <w:t>2-8</w:t>
+            </w:r>
+          </w:p>
+        </w:tc>
+        <w:tc>
+          <w:tcPr>
+            <w:tcW w:type="dxa" w:w="2520"/>
+          </w:tcPr>
+          <w:p>
+            <w:r>
+              <w:rPr>
+                <w:b w:val="0"/>
+                <w:sz w:val="19"/>
+              </w:rPr>
+              <w:t>La persona a cámara, plano medio, la hoja a un lado.</w:t>
+            </w:r>
+          </w:p>
+        </w:tc>
+        <w:tc>
+          <w:tcPr>
+            <w:tcW w:type="dxa" w:w="2520"/>
+          </w:tcPr>
+          <w:p>
+            <w:r>
+              <w:rPr>
+                <w:b w:val="0"/>
+                <w:sz w:val="19"/>
               </w:rPr>
               <w:t>"El Marco Común Europeo calcula entre quinientas y seiscientas horas de clase para llegar a B2."</w:t>
             </w:r>
           </w:p>
+        </w:tc>
+        <w:tc>
+          <w:tcPr>
+            <w:tcW w:type="dxa" w:w="2520"/>
+          </w:tcPr>
           <w:p>
-            <w:pPr>
-              <w:spacing w:after="60"/>
-            </w:pPr>
             <w:r>
               <w:rPr>
-                <w:sz w:val="20"/>
+                <w:b w:val="0"/>
+                <w:sz w:val="19"/>
               </w:rPr>
-              <w:t>"Si estudias dos horas por semana, son cinco años. Aquí: cuatro horas al día, siete meses. O si trabajas, dos horas cada noche: catorce."</w:t>
+              <w:t>"B2 = 500-600 h (Marco Común Europeo)"</w:t>
             </w:r>
           </w:p>
+        </w:tc>
+      </w:tr>
+      <w:tr>
+        <w:tc>
+          <w:tcPr>
+            <w:tcW w:type="dxa" w:w="2520"/>
+          </w:tcPr>
           <w:p>
-            <w:pPr>
-              <w:spacing w:after="60"/>
-            </w:pPr>
             <w:r>
               <w:rPr>
-                <w:sz w:val="20"/>
+                <w:b/>
+                <w:sz w:val="19"/>
+              </w:rPr>
+              <w:t>8-18</w:t>
+            </w:r>
+          </w:p>
+        </w:tc>
+        <w:tc>
+          <w:tcPr>
+            <w:tcW w:type="dxa" w:w="2520"/>
+          </w:tcPr>
+          <w:p>
+            <w:r>
+              <w:rPr>
+                <w:b w:val="0"/>
+                <w:sz w:val="19"/>
+              </w:rPr>
+              <w:t>Mientras habla escribe en la hoja, de verdad y en el momento: "575 h", "7 meses", "14 meses". Las cifras tienen que leerse.</w:t>
+            </w:r>
+          </w:p>
+        </w:tc>
+        <w:tc>
+          <w:tcPr>
+            <w:tcW w:type="dxa" w:w="2520"/>
+          </w:tcPr>
+          <w:p>
+            <w:r>
+              <w:rPr>
+                <w:b w:val="0"/>
+                <w:sz w:val="19"/>
+              </w:rPr>
+              <w:t>"Si estudias dos horas por semana, son cinco años. En Heiiu: cuatro horas al día, siete meses. O si trabajas, dos horas cada noche: catorce."</w:t>
+            </w:r>
+          </w:p>
+        </w:tc>
+        <w:tc>
+          <w:tcPr>
+            <w:tcW w:type="dxa" w:w="2520"/>
+          </w:tcPr>
+          <w:p>
+            <w:r>
+              <w:rPr>
+                <w:b w:val="0"/>
+                <w:sz w:val="19"/>
+              </w:rPr>
+              <w:t>"2 h/semana = 5 años" · luego "En Heiiu: 7 meses · noche: 14"</w:t>
+            </w:r>
+          </w:p>
+        </w:tc>
+      </w:tr>
+      <w:tr>
+        <w:tc>
+          <w:tcPr>
+            <w:tcW w:type="dxa" w:w="2520"/>
+          </w:tcPr>
+          <w:p>
+            <w:r>
+              <w:rPr>
+                <w:b/>
+                <w:sz w:val="19"/>
+              </w:rPr>
+              <w:t>18-22</w:t>
+            </w:r>
+          </w:p>
+        </w:tc>
+        <w:tc>
+          <w:tcPr>
+            <w:tcW w:type="dxa" w:w="2520"/>
+          </w:tcPr>
+          <w:p>
+            <w:r>
+              <w:rPr>
+                <w:b w:val="0"/>
+                <w:sz w:val="19"/>
+              </w:rPr>
+              <w:t>Vuelve a cámara, seria, sin sonrisa de comercial.</w:t>
+            </w:r>
+          </w:p>
+        </w:tc>
+        <w:tc>
+          <w:tcPr>
+            <w:tcW w:type="dxa" w:w="2520"/>
+          </w:tcPr>
+          <w:p>
+            <w:r>
+              <w:rPr>
+                <w:b w:val="0"/>
+                <w:sz w:val="19"/>
               </w:rPr>
               <w:t>"No es fácil. Es rápido porque es intenso."</w:t>
             </w:r>
           </w:p>
+        </w:tc>
+        <w:tc>
+          <w:tcPr>
+            <w:tcW w:type="dxa" w:w="2520"/>
+          </w:tcPr>
           <w:p>
-            <w:pPr>
-              <w:spacing w:after="60"/>
-            </w:pPr>
             <w:r>
               <w:rPr>
-                <w:sz w:val="20"/>
+                <w:b w:val="0"/>
+                <w:sz w:val="19"/>
               </w:rPr>
-              <w:t>Texto en pantalla: "B2 = 500-600 h (Marco Común Europeo)" · "2 h/semana = 5 años" · "Aquí: 7 meses · noche: 14" · al final: "Garantía por escrito"</w:t>
+              <w:t>(ninguna)</w:t>
             </w:r>
           </w:p>
+        </w:tc>
+      </w:tr>
+      <w:tr>
+        <w:tc>
+          <w:tcPr>
+            <w:tcW w:type="dxa" w:w="2520"/>
+          </w:tcPr>
           <w:p>
-            <w:pPr>
-              <w:spacing w:after="60"/>
-            </w:pPr>
             <w:r>
               <w:rPr>
-                <w:sz w:val="20"/>
+                <w:b/>
+                <w:sz w:val="19"/>
               </w:rPr>
-              <w:t>Cierre: "Pregúntanos qué fecha te queda. Escríbenos." Botón: WhatsApp.</w:t>
+              <w:t>22-25</w:t>
             </w:r>
           </w:p>
+        </w:tc>
+        <w:tc>
+          <w:tcPr>
+            <w:tcW w:type="dxa" w:w="2520"/>
+          </w:tcPr>
           <w:p>
-            <w:pPr>
-              <w:spacing w:after="60"/>
-            </w:pPr>
             <w:r>
               <w:rPr>
-                <w:sz w:val="20"/>
+                <w:b w:val="0"/>
+                <w:sz w:val="19"/>
               </w:rPr>
-              <w:t>VERSIÓN DE 15 SEGUNDOS (se corta en edición del mismo material; no se graba aparte): 0-3 s la profe tacha "5 AÑOS" en el tablero → 3-11 s: "Si estudias dos horas por semana, son cinco años. Aquí: cuatro horas al día, siete meses." (escribe "7 meses") → 11-15 s: "No es fácil. Es intenso. Pregúntanos qué fecha te queda."</w:t>
+              <w:t>Cierre a cámara. En el último segundo aparece el logo de Heiiu.</w:t>
             </w:r>
           </w:p>
+        </w:tc>
+        <w:tc>
+          <w:tcPr>
+            <w:tcW w:type="dxa" w:w="2520"/>
+          </w:tcPr>
           <w:p>
-            <w:pPr>
-              <w:spacing w:after="60"/>
-            </w:pPr>
             <w:r>
               <w:rPr>
-                <w:sz w:val="20"/>
+                <w:b w:val="0"/>
+                <w:sz w:val="19"/>
               </w:rPr>
-              <w:t>Nota: Las dos jornadas van en la misma pieza (4 h/día = 7 meses; 2 h/noche = 14 meses) para no dejar por fuera al nocturno. Sin precio.</w:t>
+              <w:t>"Pregúntanos qué fecha te queda. Escríbenos."</w:t>
+            </w:r>
+          </w:p>
+        </w:tc>
+        <w:tc>
+          <w:tcPr>
+            <w:tcW w:type="dxa" w:w="2520"/>
+          </w:tcPr>
+          <w:p>
+            <w:r>
+              <w:rPr>
+                <w:b w:val="0"/>
+                <w:sz w:val="19"/>
+              </w:rPr>
+              <w:t>"Garantía por escrito"</w:t>
             </w:r>
           </w:p>
         </w:tc>
       </w:tr>
     </w:tbl>
     <w:p/>
+    <w:p>
+      <w:pPr>
+        <w:spacing w:after="80"/>
+      </w:pPr>
+      <w:r>
+        <w:rPr>
+          <w:b/>
+          <w:sz w:val="21"/>
+        </w:rPr>
+        <w:t>Versión de 15 segundos</w:t>
+      </w:r>
+      <w:r>
+        <w:rPr>
+          <w:b w:val="0"/>
+          <w:sz w:val="21"/>
+        </w:rPr>
+        <w:t xml:space="preserve"> (se corta del mismo material, no se graba aparte): 0-3 s tacha "5 AÑOS" en la hoja → 3-11 s: "Si estudias dos horas por semana, son cinco años. En Heiiu: cuatro horas al día, siete meses." (escribe "7 meses") → 11-15 s: "No es fácil. Es intenso. Pregúntanos qué fecha te queda."</w:t>
+      </w:r>
+    </w:p>
+    <w:p>
+      <w:pPr>
+        <w:spacing w:after="120"/>
+      </w:pPr>
+      <w:r>
+        <w:rPr>
+          <w:b/>
+          <w:sz w:val="21"/>
+        </w:rPr>
+        <w:t>Qué vende este anuncio y qué no:</w:t>
+      </w:r>
+      <w:r>
+        <w:rPr>
+          <w:b w:val="0"/>
+          <w:sz w:val="21"/>
+        </w:rPr>
+        <w:t xml:space="preserve"> la velocidad con un número real. El Marco Común Europeo estima 500-600 horas guiadas para llegar a B2; Heiiu son 575 horas en 7 meses (4 h/día) o 14 meses (2 h/noche). "7 meses" se dice como descripción del programa; </w:t>
+      </w:r>
+      <w:r>
+        <w:rPr>
+          <w:b/>
+          <w:sz w:val="21"/>
+        </w:rPr>
+        <w:t>jamás</w:t>
+      </w:r>
+      <w:r>
+        <w:rPr>
+          <w:b w:val="0"/>
+          <w:sz w:val="21"/>
+        </w:rPr>
+        <w:t xml:space="preserve"> "garantizado que hablas en 7 meses". Sin precio. Las dos jornadas van en la misma pieza para no dejar por fuera al nocturno.</w:t>
+      </w:r>
+    </w:p>
     <w:p>
       <w:pPr>
         <w:spacing w:after="40"/>
@@ -338,19 +608,7 @@
           <w:b w:val="0"/>
           <w:sz w:val="21"/>
         </w:rPr>
-        <w:t>•  El tablero se reemplaza por una hoja, cartulina o pizarra pequeña: se escribe "5 AÑOS" grande, se tacha, y luego "575 h", "7 meses", "14 meses". Tienen que quedar legibles en cámara.</w:t>
-      </w:r>
-    </w:p>
-    <w:p>
-      <w:pPr>
-        <w:spacing w:after="40"/>
-      </w:pPr>
-      <w:r>
-        <w:rPr>
-          <w:b w:val="0"/>
-          <w:sz w:val="21"/>
-        </w:rPr>
-        <w:t>•  Donde el texto dice "Aquí", se dice "En Heiiu".</w:t>
+        <w:t>•  En vez de tablero se usa una hoja, cartulina o pizarra pequeña (ya está así en la tabla).</w:t>
       </w:r>
     </w:p>
     <w:p>
@@ -420,7 +678,7 @@
           <w:color w:val="E54C09"/>
           <w:sz w:val="26"/>
         </w:rPr>
-        <w:t>3. Reglas de grabación y edición (las mismas del videógrafo)</w:t>
+        <w:t>3. Reglas de grabación y edición (las mismas de todos nuestros anuncios)</w:t>
       </w:r>
     </w:p>
     <w:p>
@@ -1143,7 +1401,7 @@
           <w:b w:val="0"/>
           <w:sz w:val="21"/>
         </w:rPr>
-        <w:t xml:space="preserve">: recibes el guion escrito por gerencia, grabas en la academia con los profes y los estudiantes, editas y entregas el video listo con su código, con estas mismas reglas (hoy lo hace nuestro videógrafo; esta prueba mide esa parte, desde casa, antes de grabar en la academia); y (2) </w:t>
+        <w:t xml:space="preserve">: recibes el guion escrito por gerencia, grabas en la academia con los profes y los estudiantes, editas y entregas el video listo con su código, con estas mismas reglas (esta prueba mide esa parte, desde casa, antes de grabar en la academia); y (2) </w:t>
       </w:r>
       <w:r>
         <w:rPr>

</xml_diff>

<commit_message>
Brief prueba CM: segunda ronda de comentarios (sin explicaciones obvias, 15 s en tabla, tono de sugerencias, comunicacion abierta)
Co-Authored-By: Claude Fable 5.1 <noreply@anthropic.com>
</commit_message>
<xml_diff>
--- a/recursos/comercial/contratacion/COMMUNITY_MANAGER/BRIEF_PRUEBA_PRACTICA_CM.docx
+++ b/recursos/comercial/contratacion/COMMUNITY_MANAGER/BRIEF_PRUEBA_PRACTICA_CM.docx
@@ -137,40 +137,21 @@
           <w:b w:val="0"/>
           <w:sz w:val="21"/>
         </w:rPr>
-        <w:t xml:space="preserve"> Te grabas tú, o alguien que te haga el favor, en tu casa o donde quieras. Quien sale a cámara habla como </w:t>
+        <w:t xml:space="preserve"> Te grabas tú, o alguien que te haga el favor, en tu casa o donde quieras. Quien sale a cámara habla como presentador(a). El guion es el mismo que se graba en la academia con la profe; abajo está adaptado para casa. Todo lo demás se ejecuta tal cual. </w:t>
       </w:r>
       <w:r>
         <w:rPr>
           <w:b/>
           <w:sz w:val="21"/>
         </w:rPr>
-        <w:t>narrador(a)</w:t>
+        <w:t>Si algo no queda claro, escríbenos antes de grabar:</w:t>
       </w:r>
       <w:r>
         <w:rPr>
           <w:b w:val="0"/>
           <w:sz w:val="21"/>
         </w:rPr>
-        <w:t>: no dice ser profesor(a) ni estudiante de Heiiu. El guion es el mismo que se graba en la academia con la profe; abajo está adaptado para casa. Todo lo demás se ejecuta tal cual.</w:t>
-      </w:r>
-    </w:p>
-    <w:p>
-      <w:pPr>
-        <w:spacing w:after="80"/>
-      </w:pPr>
-      <w:r>
-        <w:rPr>
-          <w:b/>
-          <w:sz w:val="21"/>
-        </w:rPr>
-        <w:t>Tres palabras que vas a ver abajo:</w:t>
-      </w:r>
-      <w:r>
-        <w:rPr>
-          <w:b w:val="0"/>
-          <w:sz w:val="21"/>
-        </w:rPr>
-        <w:t xml:space="preserve"> *los primeros 2 segundos* son lo que hace que la persona deje de deslizar en Instagram o TikTok y se quede viendo; *lo que se dice* va hablado y además en subtítulos palabra por palabra; *las letras en pantalla* son textos grandes sobre el video (no son los subtítulos), en naranja o amarillo de la marca.</w:t>
+        <w:t xml:space="preserve"> preferimos la comunicación abierta y resolver dudas a tiempo; intentamos dártelo muy detallado, pero cualquier pregunta es bienvenida.</w:t>
       </w:r>
     </w:p>
     <w:tbl>
@@ -224,7 +205,7 @@
                 <w:b/>
                 <w:sz w:val="19"/>
               </w:rPr>
-              <w:t>Qué dice la persona (tal cual)</w:t>
+              <w:t>Qué dice la persona (hablado + subtítulos, tal cual)</w:t>
             </w:r>
           </w:p>
         </w:tc>
@@ -238,7 +219,7 @@
                 <w:b/>
                 <w:sz w:val="19"/>
               </w:rPr>
-              <w:t>Letras grandes en pantalla</w:t>
+              <w:t>Letras grandes en pantalla (texto sobre el video)</w:t>
             </w:r>
           </w:p>
         </w:tc>
@@ -384,7 +365,7 @@
                 <w:b w:val="0"/>
                 <w:sz w:val="19"/>
               </w:rPr>
-              <w:t>Mientras habla escribe en la hoja, de verdad y en el momento: "575 h", "7 meses", "14 meses". Las cifras tienen que leerse.</w:t>
+              <w:t>Mientras habla, escribe en la hoja frente a la cámara (no llevarlo escrito de antes): "575 h", "7 meses", "14 meses", con letra grande para que se lea.</w:t>
             </w:r>
           </w:p>
         </w:tc>
@@ -537,7 +518,7 @@
     <w:p/>
     <w:p>
       <w:pPr>
-        <w:spacing w:after="80"/>
+        <w:spacing w:after="60"/>
       </w:pPr>
       <w:r>
         <w:rPr>
@@ -551,9 +532,198 @@
           <w:b w:val="0"/>
           <w:sz w:val="21"/>
         </w:rPr>
-        <w:t xml:space="preserve"> (se corta del mismo material, no se graba aparte): 0-3 s tacha "5 AÑOS" en la hoja → 3-11 s: "Si estudias dos horas por semana, son cinco años. En Heiiu: cuatro horas al día, siete meses." (escribe "7 meses") → 11-15 s: "No es fácil. Es intenso. Pregúntanos qué fecha te queda."</w:t>
+        <w:t xml:space="preserve"> (se corta del mismo material; no se graba aparte):</w:t>
       </w:r>
     </w:p>
+    <w:tbl>
+      <w:tblPr>
+        <w:tblStyle w:val="TableGrid"/>
+        <w:tblW w:type="auto" w:w="0"/>
+        <w:tblLook w:firstColumn="1" w:firstRow="1" w:lastColumn="0" w:lastRow="0" w:noHBand="0" w:noVBand="1" w:val="04A0"/>
+      </w:tblPr>
+      <w:tblGrid>
+        <w:gridCol w:w="3360"/>
+        <w:gridCol w:w="3360"/>
+        <w:gridCol w:w="3360"/>
+      </w:tblGrid>
+      <w:tr>
+        <w:tc>
+          <w:tcPr>
+            <w:tcW w:type="dxa" w:w="3360"/>
+          </w:tcPr>
+          <w:p>
+            <w:r>
+              <w:rPr>
+                <w:b/>
+                <w:sz w:val="19"/>
+              </w:rPr>
+              <w:t>Segundos</w:t>
+            </w:r>
+          </w:p>
+        </w:tc>
+        <w:tc>
+          <w:tcPr>
+            <w:tcW w:type="dxa" w:w="3360"/>
+          </w:tcPr>
+          <w:p>
+            <w:r>
+              <w:rPr>
+                <w:b/>
+                <w:sz w:val="19"/>
+              </w:rPr>
+              <w:t>Qué se ve</w:t>
+            </w:r>
+          </w:p>
+        </w:tc>
+        <w:tc>
+          <w:tcPr>
+            <w:tcW w:type="dxa" w:w="3360"/>
+          </w:tcPr>
+          <w:p>
+            <w:r>
+              <w:rPr>
+                <w:b/>
+                <w:sz w:val="19"/>
+              </w:rPr>
+              <w:t>Qué dice (tal cual)</w:t>
+            </w:r>
+          </w:p>
+        </w:tc>
+      </w:tr>
+      <w:tr>
+        <w:tc>
+          <w:tcPr>
+            <w:tcW w:type="dxa" w:w="3360"/>
+          </w:tcPr>
+          <w:p>
+            <w:r>
+              <w:rPr>
+                <w:b/>
+                <w:sz w:val="19"/>
+              </w:rPr>
+              <w:t>0-3</w:t>
+            </w:r>
+          </w:p>
+        </w:tc>
+        <w:tc>
+          <w:tcPr>
+            <w:tcW w:type="dxa" w:w="3360"/>
+          </w:tcPr>
+          <w:p>
+            <w:r>
+              <w:rPr>
+                <w:b w:val="0"/>
+                <w:sz w:val="19"/>
+              </w:rPr>
+              <w:t>Tacha "5 AÑOS" en la hoja.</w:t>
+            </w:r>
+          </w:p>
+        </w:tc>
+        <w:tc>
+          <w:tcPr>
+            <w:tcW w:type="dxa" w:w="3360"/>
+          </w:tcPr>
+          <w:p>
+            <w:r>
+              <w:rPr>
+                <w:b w:val="0"/>
+                <w:sz w:val="19"/>
+              </w:rPr>
+              <w:t>(no habla)</w:t>
+            </w:r>
+          </w:p>
+        </w:tc>
+      </w:tr>
+      <w:tr>
+        <w:tc>
+          <w:tcPr>
+            <w:tcW w:type="dxa" w:w="3360"/>
+          </w:tcPr>
+          <w:p>
+            <w:r>
+              <w:rPr>
+                <w:b/>
+                <w:sz w:val="19"/>
+              </w:rPr>
+              <w:t>3-11</w:t>
+            </w:r>
+          </w:p>
+        </w:tc>
+        <w:tc>
+          <w:tcPr>
+            <w:tcW w:type="dxa" w:w="3360"/>
+          </w:tcPr>
+          <w:p>
+            <w:r>
+              <w:rPr>
+                <w:b w:val="0"/>
+                <w:sz w:val="19"/>
+              </w:rPr>
+              <w:t>A cámara; escribe "7 meses".</w:t>
+            </w:r>
+          </w:p>
+        </w:tc>
+        <w:tc>
+          <w:tcPr>
+            <w:tcW w:type="dxa" w:w="3360"/>
+          </w:tcPr>
+          <w:p>
+            <w:r>
+              <w:rPr>
+                <w:b w:val="0"/>
+                <w:sz w:val="19"/>
+              </w:rPr>
+              <w:t>"Si estudias dos horas por semana, son cinco años. En Heiiu: cuatro horas al día, siete meses."</w:t>
+            </w:r>
+          </w:p>
+        </w:tc>
+      </w:tr>
+      <w:tr>
+        <w:tc>
+          <w:tcPr>
+            <w:tcW w:type="dxa" w:w="3360"/>
+          </w:tcPr>
+          <w:p>
+            <w:r>
+              <w:rPr>
+                <w:b/>
+                <w:sz w:val="19"/>
+              </w:rPr>
+              <w:t>11-15</w:t>
+            </w:r>
+          </w:p>
+        </w:tc>
+        <w:tc>
+          <w:tcPr>
+            <w:tcW w:type="dxa" w:w="3360"/>
+          </w:tcPr>
+          <w:p>
+            <w:r>
+              <w:rPr>
+                <w:b w:val="0"/>
+                <w:sz w:val="19"/>
+              </w:rPr>
+              <w:t>Cierre a cámara + logo en el último segundo.</w:t>
+            </w:r>
+          </w:p>
+        </w:tc>
+        <w:tc>
+          <w:tcPr>
+            <w:tcW w:type="dxa" w:w="3360"/>
+          </w:tcPr>
+          <w:p>
+            <w:r>
+              <w:rPr>
+                <w:b w:val="0"/>
+                <w:sz w:val="19"/>
+              </w:rPr>
+              <w:t>"No es fácil. Es intenso. Pregúntanos qué fecha te queda."</w:t>
+            </w:r>
+          </w:p>
+        </w:tc>
+      </w:tr>
+    </w:tbl>
+    <w:p/>
     <w:p>
       <w:pPr>
         <w:spacing w:after="120"/>
@@ -644,28 +814,14 @@
           <w:b/>
           <w:sz w:val="21"/>
         </w:rPr>
-        <w:t>Sobre las opiniones:</w:t>
+        <w:t>Si ves algo que mejoraría el guion</w:t>
       </w:r>
       <w:r>
         <w:rPr>
           <w:b w:val="0"/>
           <w:sz w:val="21"/>
         </w:rPr>
-        <w:t xml:space="preserve"> si crees que algo del guion debería cambiar (una palabra, el orden, el gancho), </w:t>
-      </w:r>
-      <w:r>
-        <w:rPr>
-          <w:b/>
-          <w:sz w:val="21"/>
-        </w:rPr>
-        <w:t>entregas el video como está escrito</w:t>
-      </w:r>
-      <w:r>
-        <w:rPr>
-          <w:b w:val="0"/>
-          <w:sz w:val="21"/>
-        </w:rPr>
-        <w:t xml:space="preserve"> y mandas tus sugerencias aparte, en un mensaje de WhatsApp, con el porqué. Las dos cosas se valoran: que ejecutes lo que se pide y que pienses. Lo que no se valora es cambiar el guion por tu cuenta.</w:t>
+        <w:t xml:space="preserve"> (una palabra, el orden, el inicio), nos encanta escucharlo: entrega el video como está escrito y mándanos tus ideas aparte, por WhatsApp, con el porqué. Así conocemos las dos cosas que nos importan: cómo ejecutas y cómo piensas.</w:t>
       </w:r>
     </w:p>
     <w:p>
@@ -848,7 +1004,7 @@
           <w:b w:val="0"/>
           <w:sz w:val="21"/>
         </w:rPr>
-        <w:t>. Si la profe dice algo prohibido, se repite la toma.</w:t>
+        <w:t>. Si a quien habla se le sale algo prohibido, se repite la toma.</w:t>
       </w:r>
     </w:p>
     <w:p>
@@ -1194,7 +1350,7 @@
                 <w:b w:val="0"/>
                 <w:sz w:val="19"/>
               </w:rPr>
-              <w:t>La profe dice el texto tal cual; "575 h", "7 meses" y "14 meses" quedan escritos en el tablero y legibles.</w:t>
+              <w:t>La persona dice el texto tal cual; "575 h", "7 meses" y "14 meses" quedan escritos en la hoja y legibles.</w:t>
             </w:r>
           </w:p>
         </w:tc>
@@ -1428,7 +1584,7 @@
           <w:color w:val="666666"/>
           <w:sz w:val="19"/>
         </w:rPr>
-        <w:t>Dudas sobre el guion o la logística: por WhatsApp a gerencia antes de grabar. Lo que no esté escrito en el guion no se inventa: se pregunta.</w:t>
+        <w:t>Cualquier duda sobre el guion o la logística: por WhatsApp a gerencia, antes de grabar. Lo que no esté escrito en el guion, se pregunta.</w:t>
       </w:r>
     </w:p>
     <w:sectPr>

</xml_diff>

<commit_message>
Brief prueba CM: las dos marcas (academia + constructora), publicar en redes hace parte del trabajo; ediciones de Diana
Co-Authored-By: Claude Fable 5.1 <noreply@anthropic.com>
</commit_message>
<xml_diff>
--- a/recursos/comercial/contratacion/COMMUNITY_MANAGER/BRIEF_PRUEBA_PRACTICA_CM.docx
+++ b/recursos/comercial/contratacion/COMMUNITY_MANAGER/BRIEF_PRUEBA_PRACTICA_CM.docx
@@ -12,7 +12,7 @@
           <w:color w:val="666666"/>
           <w:sz w:val="20"/>
         </w:rPr>
-        <w:t>HEIIU ENGLISH ACADEMY · COMMUNITY MANAGER</w:t>
+        <w:t>HEIIU ENGLISH ACADEMY + CONSTRUCTORA · COMMUNITY MANAGER DE LAS DOS MARCAS</w:t>
       </w:r>
     </w:p>
     <w:p>
@@ -38,7 +38,7 @@
           <w:color w:val="666666"/>
           <w:sz w:val="19"/>
         </w:rPr>
-        <w:t>Pago: $100.000 contra entrega. Se paga igual si pasas o no la prueba. El material entregado queda para uso de la academia.</w:t>
+        <w:t>Pago: $100.000 contra entrega. Se paga igual si pasas o no la prueba. El material entregado queda para uso de la academia. Esta prueba usa un guion de la academia como ejemplo; el cargo cubre las dos marcas (academia y constructora) y sus redes.</w:t>
       </w:r>
     </w:p>
     <w:p>
@@ -63,7 +63,7 @@
           <w:b w:val="0"/>
           <w:sz w:val="21"/>
         </w:rPr>
-        <w:t xml:space="preserve">En Heiiu los anuncios de pauta paga se producen a partir de </w:t>
+        <w:t xml:space="preserve">En las dos marcas (Heiiu y la constructora) los anuncios de pauta paga se producen a partir de </w:t>
       </w:r>
       <w:r>
         <w:rPr>
@@ -77,7 +77,7 @@
           <w:b w:val="0"/>
           <w:sz w:val="21"/>
         </w:rPr>
-        <w:t xml:space="preserve">: cada guion trae los primeros segundos que detienen a la persona, el texto que se dice tal cual, lo que se ve, las letras que van en pantalla, el cierre y un </w:t>
+        <w:t xml:space="preserve">: cada guion trae los primeros segundos o gancho, el texto que se dice tal cual, lo que se ve, las letras que van en pantalla, el cierre y un </w:t>
       </w:r>
       <w:r>
         <w:rPr>
@@ -821,7 +821,7 @@
           <w:b w:val="0"/>
           <w:sz w:val="21"/>
         </w:rPr>
-        <w:t xml:space="preserve"> (una palabra, el orden, el inicio), nos encanta escucharlo: entrega el video como está escrito y mándanos tus ideas aparte, por WhatsApp, con el porqué. Así conocemos las dos cosas que nos importan: cómo ejecutas y cómo piensas.</w:t>
+        <w:t xml:space="preserve"> (una palabra, el orden, el inicio), por favor dínoslo lo antes posible para tenerlo en cuenta.</w:t>
       </w:r>
     </w:p>
     <w:p>
@@ -1486,7 +1486,7 @@
                 <w:b/>
                 <w:sz w:val="19"/>
               </w:rPr>
-              <w:t>7. Entrega y sugerencias</w:t>
+              <w:t>7. Entrega</w:t>
             </w:r>
           </w:p>
         </w:tc>
@@ -1500,7 +1500,7 @@
                 <w:b w:val="0"/>
                 <w:sz w:val="19"/>
               </w:rPr>
-              <w:t>En la fecha que propusiste. El video va como está escrito; las sugerencias, si las hay, aparte y con su porqué.</w:t>
+              <w:t>En la fecha que propusiste, con el guion ejecutado como está escrito (las mejoras que propongas se conversan antes de grabar).</w:t>
             </w:r>
           </w:p>
         </w:tc>
@@ -1529,21 +1529,21 @@
           <w:b w:val="0"/>
           <w:sz w:val="21"/>
         </w:rPr>
-        <w:t xml:space="preserve">Si pasas la prueba, se firma el contrato de prestación de servicios en las condiciones conversadas. El trabajo mensual tiene </w:t>
+        <w:t xml:space="preserve">Si pasas la prueba, se firma el contrato de prestación de servicios en las condiciones conversadas, para las </w:t>
       </w:r>
       <w:r>
         <w:rPr>
           <w:b/>
           <w:sz w:val="21"/>
         </w:rPr>
-        <w:t>dos partes</w:t>
+        <w:t>dos marcas: la academia y la constructora</w:t>
       </w:r>
       <w:r>
         <w:rPr>
           <w:b w:val="0"/>
           <w:sz w:val="21"/>
         </w:rPr>
-        <w:t xml:space="preserve">: (1) </w:t>
+        <w:t xml:space="preserve">. En cada una el trabajo mensual tiene dos partes: (1) </w:t>
       </w:r>
       <w:r>
         <w:rPr>
@@ -1557,7 +1557,7 @@
           <w:b w:val="0"/>
           <w:sz w:val="21"/>
         </w:rPr>
-        <w:t xml:space="preserve">: recibes el guion escrito por gerencia, grabas en la academia con los profes y los estudiantes, editas y entregas el video listo con su código, con estas mismas reglas (esta prueba mide esa parte, desde casa, antes de grabar en la academia); y (2) </w:t>
+        <w:t xml:space="preserve">: recibes el guion escrito por gerencia, grabas (en la academia con los profes y los estudiantes; en la constructora en sus proyectos), editas y entregas el video listo con su código, con estas mismas reglas (esta prueba mide esa parte, desde casa, antes de grabar en sitio); y (2) </w:t>
       </w:r>
       <w:r>
         <w:rPr>
@@ -1571,7 +1571,26 @@
           <w:b w:val="0"/>
           <w:sz w:val="21"/>
         </w:rPr>
-        <w:t>: testimonios, ejercicios en clase, historias y el día a día de la academia, guiado por tu creatividad y por las ideas que te demos, respetando las reglas de mensaje de Heiiu (la lista de prohibidos de la sección 3).</w:t>
+        <w:t>: en la academia, testimonios, ejercicios en clase, historias y el día a día; en la constructora, sus proyectos, avances y clientes; guiado por tu creatividad y por las ideas que te demos, respetando las reglas de mensaje de cada marca (las de Heiiu son la lista de prohibidos de la sección 3; las de la constructora se entregan aparte).</w:t>
+      </w:r>
+    </w:p>
+    <w:p>
+      <w:pPr>
+        <w:spacing w:after="80"/>
+      </w:pPr>
+      <w:r>
+        <w:rPr>
+          <w:b/>
+          <w:sz w:val="21"/>
+        </w:rPr>
+        <w:t>Publicar hace parte del trabajo, no es un adicional:</w:t>
+      </w:r>
+      <w:r>
+        <w:rPr>
+          <w:b w:val="0"/>
+          <w:sz w:val="21"/>
+        </w:rPr>
+        <w:t xml:space="preserve"> el contenido orgánico de cada marca se programa y se publica en sus redes (Heiiu tiene Instagram, TikTok y Facebook; la constructora, las suyas), con la parrilla mensual y el informe de resultados que ya conversamos. Los anuncios de pauta, en cambio, los sube el trafficker.</w:t>
       </w:r>
     </w:p>
     <w:p>

</xml_diff>

<commit_message>
Brief prueba CM: PCG Constructora con sus redes
Co-Authored-By: Claude Fable 5.1 <noreply@anthropic.com>
</commit_message>
<xml_diff>
--- a/recursos/comercial/contratacion/COMMUNITY_MANAGER/BRIEF_PRUEBA_PRACTICA_CM.docx
+++ b/recursos/comercial/contratacion/COMMUNITY_MANAGER/BRIEF_PRUEBA_PRACTICA_CM.docx
@@ -12,7 +12,7 @@
           <w:color w:val="666666"/>
           <w:sz w:val="20"/>
         </w:rPr>
-        <w:t>HEIIU ENGLISH ACADEMY + CONSTRUCTORA · COMMUNITY MANAGER DE LAS DOS MARCAS</w:t>
+        <w:t>HEIIU ENGLISH ACADEMY + PCG CONSTRUCTORA · COMMUNITY MANAGER DE LAS DOS MARCAS</w:t>
       </w:r>
     </w:p>
     <w:p>
@@ -38,7 +38,7 @@
           <w:color w:val="666666"/>
           <w:sz w:val="19"/>
         </w:rPr>
-        <w:t>Pago: $100.000 contra entrega. Se paga igual si pasas o no la prueba. El material entregado queda para uso de la academia. Esta prueba usa un guion de la academia como ejemplo; el cargo cubre las dos marcas (academia y constructora) y sus redes.</w:t>
+        <w:t>Pago: $100.000 contra entrega. Se paga igual si pasas o no la prueba. El material entregado queda para uso de la academia. Esta prueba usa un guion de la academia como ejemplo; el cargo cubre las dos marcas (Heiiu y PCG Constructora) y sus redes.</w:t>
       </w:r>
     </w:p>
     <w:p>
@@ -63,7 +63,7 @@
           <w:b w:val="0"/>
           <w:sz w:val="21"/>
         </w:rPr>
-        <w:t xml:space="preserve">En las dos marcas (Heiiu y la constructora) los anuncios de pauta paga se producen a partir de </w:t>
+        <w:t xml:space="preserve">En las dos marcas (Heiiu y PCG Constructora) los anuncios de pauta paga se producen a partir de </w:t>
       </w:r>
       <w:r>
         <w:rPr>
@@ -1536,7 +1536,7 @@
           <w:b/>
           <w:sz w:val="21"/>
         </w:rPr>
-        <w:t>dos marcas: la academia y la constructora</w:t>
+        <w:t>dos marcas: Heiiu y PCG Constructora</w:t>
       </w:r>
       <w:r>
         <w:rPr>
@@ -1557,7 +1557,7 @@
           <w:b w:val="0"/>
           <w:sz w:val="21"/>
         </w:rPr>
-        <w:t xml:space="preserve">: recibes el guion escrito por gerencia, grabas (en la academia con los profes y los estudiantes; en la constructora en sus proyectos), editas y entregas el video listo con su código, con estas mismas reglas (esta prueba mide esa parte, desde casa, antes de grabar en sitio); y (2) </w:t>
+        <w:t xml:space="preserve">: recibes el guion escrito por gerencia, grabas (en la academia con los profes y los estudiantes; en PCG en sus proyectos), editas y entregas el video listo con su código, con estas mismas reglas (esta prueba mide esa parte, desde casa, antes de grabar en sitio); y (2) </w:t>
       </w:r>
       <w:r>
         <w:rPr>
@@ -1571,7 +1571,7 @@
           <w:b w:val="0"/>
           <w:sz w:val="21"/>
         </w:rPr>
-        <w:t>: en la academia, testimonios, ejercicios en clase, historias y el día a día; en la constructora, sus proyectos, avances y clientes; guiado por tu creatividad y por las ideas que te demos, respetando las reglas de mensaje de cada marca (las de Heiiu son la lista de prohibidos de la sección 3; las de la constructora se entregan aparte).</w:t>
+        <w:t>: en la academia, testimonios, ejercicios en clase, historias y el día a día; en PCG Constructora, sus proyectos, avances y clientes; guiado por tu creatividad y por las ideas que te demos, respetando las reglas de mensaje de cada marca (las de Heiiu son la lista de prohibidos de la sección 3; las de PCG Constructora se entregan aparte; la pauta de PCG se está diseñando con el mismo flujo).</w:t>
       </w:r>
     </w:p>
     <w:p>
@@ -1590,7 +1590,7 @@
           <w:b w:val="0"/>
           <w:sz w:val="21"/>
         </w:rPr>
-        <w:t xml:space="preserve"> el contenido orgánico de cada marca se programa y se publica en sus redes (Heiiu tiene Instagram, TikTok y Facebook; la constructora, las suyas), con la parrilla mensual y el informe de resultados que ya conversamos. Los anuncios de pauta, en cambio, los sube el trafficker.</w:t>
+        <w:t xml:space="preserve"> el contenido orgánico de cada marca se programa y se publica en sus redes (Heiiu: Instagram, TikTok y Facebook; PCG Constructora: Instagram @constructorapcg y Facebook), con la parrilla mensual y el informe de resultados que ya conversamos. Los anuncios de pauta, en cambio, los sube el trafficker.</w:t>
       </w:r>
     </w:p>
     <w:p>

</xml_diff>